<commit_message>
entire rough structure ready
</commit_message>
<xml_diff>
--- a/_includes/projects/past/stoch/output/stoch.docx
+++ b/_includes/projects/past/stoch/output/stoch.docx
@@ -45,6 +45,7 @@
       <w:hyperlink r:id="rId20">
         <w:r>
           <w:rPr>
+            <w:b/>
             <w:rStyle w:val="Hyperlink"/>
           </w:rPr>
           <w:t xml:space="preserve">RBCCPS</w:t>
@@ -67,26 +68,76 @@
     </w:p>
     <w:p>
       <w:pPr>
-        <w:pStyle w:val="Heading3"/>
-      </w:pPr>
-      <w:bookmarkStart w:id="21" w:name="introduction"/>
-      <w:r>
-        <w:t xml:space="preserve">Introduction</w:t>
+        <w:pStyle w:val="FirstParagraph"/>
+      </w:pPr>
+      <w:r>
+        <w:t xml:space="preserve"> </w:t>
+      </w:r>
+    </w:p>
+    <w:p>
+      <w:pPr>
+        <w:pStyle w:val="Heading2"/>
+      </w:pPr>
+      <w:bookmarkStart w:id="21" w:name="breif-overview"/>
+      <w:r>
+        <w:t xml:space="preserve">Breif Overview</w:t>
       </w:r>
       <w:bookmarkEnd w:id="21"/>
     </w:p>
     <w:p>
       <w:pPr>
-        <w:pStyle w:val="FirstParagraph"/>
-      </w:pPr>
-      <w:hyperlink r:id="rId22">
-        <w:r>
-          <w:rPr>
-            <w:rStyle w:val="Hyperlink"/>
-          </w:rPr>
-          <w:t xml:space="preserve">Stoch-1.0 developed at RBCCPS</w:t>
-        </w:r>
-      </w:hyperlink>
+        <w:pStyle w:val="CaptionedFigure"/>
+      </w:pPr>
+      <w:r>
+        <w:drawing>
+          <wp:inline>
+            <wp:extent cx="5334000" cy="3556000"/>
+            <wp:effectExtent b="0" l="0" r="0" t="0"/>
+            <wp:docPr descr="Stoch-1.0 developed at RBCCPS" title="" id="1" name="Picture"/>
+            <a:graphic>
+              <a:graphicData uri="http://schemas.openxmlformats.org/drawingml/2006/picture">
+                <pic:pic>
+                  <pic:nvPicPr>
+                    <pic:cNvPr descr="https://ajaygunalan.github.io/projects/asset/past/stoch/stoch_one.jpg" id="0" name="Picture"/>
+                    <pic:cNvPicPr>
+                      <a:picLocks noChangeArrowheads="1" noChangeAspect="1"/>
+                    </pic:cNvPicPr>
+                  </pic:nvPicPr>
+                  <pic:blipFill>
+                    <a:blip r:embed="rId22"/>
+                    <a:stretch>
+                      <a:fillRect/>
+                    </a:stretch>
+                  </pic:blipFill>
+                  <pic:spPr bwMode="auto">
+                    <a:xfrm>
+                      <a:off x="0" y="0"/>
+                      <a:ext cx="5334000" cy="3556000"/>
+                    </a:xfrm>
+                    <a:prstGeom prst="rect">
+                      <a:avLst/>
+                    </a:prstGeom>
+                    <a:noFill/>
+                    <a:ln w="9525">
+                      <a:noFill/>
+                      <a:headEnd/>
+                      <a:tailEnd/>
+                    </a:ln>
+                  </pic:spPr>
+                </pic:pic>
+              </a:graphicData>
+            </a:graphic>
+          </wp:inline>
+        </w:drawing>
+      </w:r>
+    </w:p>
+    <w:p>
+      <w:pPr>
+        <w:pStyle w:val="ImageCaption"/>
+      </w:pPr>
+      <w:r>
+        <w:t xml:space="preserve">Stoch-1.0 developed at RBCCPS</w:t>
+      </w:r>
     </w:p>
     <w:p>
       <w:pPr>
@@ -105,13 +156,6 @@
       </w:pPr>
       <w:r>
         <w:t xml:space="preserve">To achieve a robust, all terrain, legged robot.</w:t>
-      </w:r>
-    </w:p>
-    <w:p>
-      <w:r>
-        <w:pict>
-          <v:rect style="width:0;height:1.5pt" o:hralign="center" o:hrstd="t" o:hr="t"/>
-        </w:pict>
       </w:r>
     </w:p>
     <w:p>
@@ -406,16 +450,20 @@
       <w:pPr>
         <w:pStyle w:val="BodyText"/>
       </w:pPr>
-      <w:r>
-        <w:rPr>
-          <w:b/>
-        </w:rPr>
+    </w:p>
+    <w:p>
+      <w:pPr>
+        <w:pStyle w:val="Heading4"/>
+      </w:pPr>
+      <w:bookmarkStart w:id="23" w:name="what-was-achieved-by-stoch-1.0"/>
+      <w:r>
         <w:t xml:space="preserve">What was achieved by Stoch 1.0 ?</w:t>
       </w:r>
-    </w:p>
-    <w:p>
-      <w:pPr>
-        <w:pStyle w:val="BodyText"/>
+      <w:bookmarkEnd w:id="23"/>
+    </w:p>
+    <w:p>
+      <w:pPr>
+        <w:pStyle w:val="FirstParagraph"/>
       </w:pPr>
       <w:r>
         <w:t xml:space="preserve">The quadruped performed variety of gaits such as walks, bounds, trots, etc…as show in this</w:t>
@@ -423,9 +471,10 @@
       <w:r>
         <w:t xml:space="preserve"> </w:t>
       </w:r>
-      <w:hyperlink r:id="rId23">
+      <w:hyperlink r:id="rId24">
         <w:r>
           <w:rPr>
+            <w:b/>
             <w:rStyle w:val="Hyperlink"/>
           </w:rPr>
           <w:t xml:space="preserve">video</w:t>
@@ -436,34 +485,39 @@
       <w:pPr>
         <w:pStyle w:val="BodyText"/>
       </w:pPr>
-      <w:r>
-        <w:rPr>
-          <w:b/>
-        </w:rPr>
+    </w:p>
+    <w:p>
+      <w:pPr>
+        <w:pStyle w:val="Heading4"/>
+      </w:pPr>
+      <w:bookmarkStart w:id="25" w:name="how-we-achieved"/>
+      <w:r>
         <w:t xml:space="preserve">How we achieved ?</w:t>
       </w:r>
+      <w:bookmarkEnd w:id="25"/>
+    </w:p>
+    <w:p>
+      <w:pPr>
+        <w:pStyle w:val="FirstParagraph"/>
+      </w:pPr>
+      <w:r>
+        <w:t xml:space="preserve">We used on-policy, model-free DRL algorithm based on actor-critic learning framework called Proximal Policy Optimisation (PPO) to generate the gaits in the simulation(PyBullet). It took 30 Million samples (5-7 hours) to learn a particular gait in the simulation. To transfer it on the hardware, we took the end-effector tarjectory form simulation and did principal component analysis to generate different gaits and we deployed on the hardware.</w:t>
+      </w:r>
     </w:p>
     <w:p>
       <w:pPr>
         <w:pStyle w:val="BodyText"/>
       </w:pPr>
       <w:r>
-        <w:t xml:space="preserve">We used on-policy, model-free DRL algorithm based on actor-critic learning framework called Proximal Policy Optimisation (PPO) to generate the gaits in the simulation(PyBullet). It took 30 Million samples (5-7 hours) to learn a particular gait in the simulation. To transfer it on the hardware we took the end-effector tarjectory form simulation and did principal component analysis to generate different gaits and we deployed on the hardware.</w:t>
-      </w:r>
-    </w:p>
-    <w:p>
-      <w:pPr>
-        <w:pStyle w:val="BodyText"/>
-      </w:pPr>
-      <w:r>
         <w:t xml:space="preserve">You can find more info in this</w:t>
       </w:r>
       <w:r>
         <w:t xml:space="preserve"> </w:t>
       </w:r>
-      <w:hyperlink r:id="rId24">
+      <w:hyperlink r:id="rId26">
         <w:r>
           <w:rPr>
+            <w:b/>
             <w:rStyle w:val="Hyperlink"/>
           </w:rPr>
           <w:t xml:space="preserve">paper</w:t>
@@ -474,12 +528,16 @@
       <w:pPr>
         <w:pStyle w:val="BodyText"/>
       </w:pPr>
-      <w:r>
-        <w:rPr>
-          <w:b/>
-        </w:rPr>
+    </w:p>
+    <w:p>
+      <w:pPr>
+        <w:pStyle w:val="Heading4"/>
+      </w:pPr>
+      <w:bookmarkStart w:id="27" w:name="next-what"/>
+      <w:r>
         <w:t xml:space="preserve">Next what ?</w:t>
       </w:r>
+      <w:bookmarkEnd w:id="27"/>
     </w:p>
     <w:p>
       <w:pPr>
@@ -535,9 +593,10 @@
       <w:r>
         <w:t xml:space="preserve"> </w:t>
       </w:r>
-      <w:hyperlink r:id="rId25">
+      <w:hyperlink r:id="rId28">
         <w:r>
           <w:rPr>
+            <w:b/>
             <w:rStyle w:val="Hyperlink"/>
           </w:rPr>
           <w:t xml:space="preserve">control and learning</w:t>
@@ -549,30 +608,514 @@
         <w:pStyle w:val="BodyText"/>
       </w:pPr>
       <w:r>
-        <w:t xml:space="preserve">I would like to mention here more on the pratical issues and evolution of this project, especially on stoch 2.0</w:t>
-      </w:r>
-    </w:p>
-    <w:p>
-      <w:pPr>
-        <w:pStyle w:val="Heading3"/>
-      </w:pPr>
-      <w:bookmarkStart w:id="26" w:name="the-team"/>
+        <w:t xml:space="preserve">I would like to mention here more on the pratical issues(behind the paper stories) and evolution of this project, especially on stoch 2.0</w:t>
+      </w:r>
+    </w:p>
+    <w:p>
+      <w:pPr>
+        <w:pStyle w:val="BodyText"/>
+      </w:pPr>
+      <w:r>
+        <w:t xml:space="preserve"> </w:t>
+      </w:r>
+    </w:p>
+    <w:p>
+      <w:pPr>
+        <w:pStyle w:val="Heading2"/>
+      </w:pPr>
+      <w:bookmarkStart w:id="29" w:name="stoch-1.0"/>
+      <w:r>
+        <w:t xml:space="preserve">Stoch 1.0</w:t>
+      </w:r>
+      <w:bookmarkEnd w:id="29"/>
+    </w:p>
+    <w:p>
+      <w:pPr>
+        <w:pStyle w:val="FirstParagraph"/>
+      </w:pPr>
+      <w:r>
+        <w:t xml:space="preserve">The project was initially motivated by Googles’s work on</w:t>
+      </w:r>
+      <w:r>
+        <w:t xml:space="preserve"> </w:t>
+      </w:r>
+      <w:hyperlink r:id="rId30">
+        <w:r>
+          <w:rPr>
+            <w:b/>
+            <w:rStyle w:val="Hyperlink"/>
+          </w:rPr>
+          <w:t xml:space="preserve">Sim-to-Real: Learning Agile Locomotion For</w:t>
+        </w:r>
+        <w:r>
+          <w:rPr>
+            <w:b/>
+            <w:rStyle w:val="Hyperlink"/>
+          </w:rPr>
+          <w:t xml:space="preserve"> </w:t>
+        </w:r>
+        <w:r>
+          <w:rPr>
+            <w:b/>
+            <w:rStyle w:val="Hyperlink"/>
+          </w:rPr>
+          <w:t xml:space="preserve">Quadruped Robots</w:t>
+        </w:r>
+      </w:hyperlink>
+      <w:r>
+        <w:t xml:space="preserve">. The essence of the paper is to imrove the transferbility from learned control policy from simualtion to hardware by:</w:t>
+      </w:r>
+    </w:p>
+    <w:p>
+      <w:pPr>
+        <w:numPr>
+          <w:numId w:val="1002"/>
+          <w:ilvl w:val="0"/>
+        </w:numPr>
+      </w:pPr>
+      <w:r>
+        <w:t xml:space="preserve">Improving the Robot Model by having:</w:t>
+      </w:r>
+    </w:p>
+    <w:p>
+      <w:pPr>
+        <w:pStyle w:val="Compact"/>
+        <w:numPr>
+          <w:numId w:val="1003"/>
+          <w:ilvl w:val="1"/>
+        </w:numPr>
+      </w:pPr>
+      <w:r>
+        <w:t xml:space="preserve">Accurate URDF by phsyically measuring many parameters</w:t>
+      </w:r>
+    </w:p>
+    <w:p>
+      <w:pPr>
+        <w:pStyle w:val="Compact"/>
+        <w:numPr>
+          <w:numId w:val="1003"/>
+          <w:ilvl w:val="1"/>
+        </w:numPr>
+      </w:pPr>
+      <w:r>
+        <w:t xml:space="preserve">Actuator Model</w:t>
+      </w:r>
+    </w:p>
+    <w:p>
+      <w:pPr>
+        <w:pStyle w:val="Compact"/>
+        <w:numPr>
+          <w:numId w:val="1003"/>
+          <w:ilvl w:val="1"/>
+        </w:numPr>
+      </w:pPr>
+      <w:r>
+        <w:t xml:space="preserve">Latency (Commuication Delay)</w:t>
+      </w:r>
+    </w:p>
+    <w:p>
+      <w:pPr>
+        <w:numPr>
+          <w:numId w:val="1002"/>
+          <w:ilvl w:val="0"/>
+        </w:numPr>
+      </w:pPr>
+      <w:r>
+        <w:t xml:space="preserve">Adding Noise to have Robust Controller:</w:t>
+      </w:r>
+    </w:p>
+    <w:p>
+      <w:pPr>
+        <w:pStyle w:val="Compact"/>
+        <w:numPr>
+          <w:numId w:val="1004"/>
+          <w:ilvl w:val="1"/>
+        </w:numPr>
+      </w:pPr>
+      <w:r>
+        <w:t xml:space="preserve">Randomising Dynamic Parameters such as Mass, Friction, etc…</w:t>
+      </w:r>
+    </w:p>
+    <w:p>
+      <w:pPr>
+        <w:pStyle w:val="Compact"/>
+        <w:numPr>
+          <w:numId w:val="1004"/>
+          <w:ilvl w:val="1"/>
+        </w:numPr>
+      </w:pPr>
+      <w:r>
+        <w:t xml:space="preserve">Random Perturbation</w:t>
+      </w:r>
+    </w:p>
+    <w:p>
+      <w:pPr>
+        <w:pStyle w:val="Compact"/>
+        <w:numPr>
+          <w:numId w:val="1004"/>
+          <w:ilvl w:val="1"/>
+        </w:numPr>
+      </w:pPr>
+      <w:r>
+        <w:t xml:space="preserve">Using a compact observation space</w:t>
+      </w:r>
+    </w:p>
+    <w:p>
+      <w:pPr>
+        <w:numPr>
+          <w:numId w:val="1002"/>
+          <w:ilvl w:val="0"/>
+        </w:numPr>
+      </w:pPr>
+      <w:r>
+        <w:t xml:space="preserve">Control of the learned policies</w:t>
+      </w:r>
+    </w:p>
+    <w:p>
+      <w:pPr>
+        <w:numPr>
+          <w:numId w:val="1000"/>
+          <w:ilvl w:val="0"/>
+        </w:numPr>
+      </w:pPr>
+      <w:r>
+        <w:t xml:space="preserve">Instead of learning the entire policy from scratch which will reult in lack of controllability, they decompose the problem into two parts:</w:t>
+      </w:r>
+    </w:p>
+    <w:p>
+      <w:pPr>
+        <w:pStyle w:val="Compact"/>
+        <w:numPr>
+          <w:numId w:val="1005"/>
+          <w:ilvl w:val="1"/>
+        </w:numPr>
+      </w:pPr>
+      <m:oMath>
+        <m:bar>
+          <m:barPr>
+            <m:pos m:val="top"/>
+          </m:barPr>
+          <m:e>
+            <m:r>
+              <m:t>a</m:t>
+            </m:r>
+          </m:e>
+        </m:bar>
+        <m:r>
+          <m:t>(</m:t>
+        </m:r>
+        <m:r>
+          <m:t>t</m:t>
+        </m:r>
+        <m:r>
+          <m:t>)</m:t>
+        </m:r>
+      </m:oMath>
+      <w:r>
+        <w:t xml:space="preserve"> </w:t>
+      </w:r>
+      <w:r>
+        <w:t xml:space="preserve">An open loop component that allows a user to provide reference trajectories</w:t>
+      </w:r>
+    </w:p>
+    <w:p>
+      <w:pPr>
+        <w:pStyle w:val="Compact"/>
+        <w:numPr>
+          <w:numId w:val="1005"/>
+          <w:ilvl w:val="1"/>
+        </w:numPr>
+      </w:pPr>
+      <m:oMath>
+        <m:r>
+          <m:t>π</m:t>
+        </m:r>
+        <m:r>
+          <m:t>(</m:t>
+        </m:r>
+        <m:r>
+          <m:t>o</m:t>
+        </m:r>
+        <m:r>
+          <m:t>)</m:t>
+        </m:r>
+      </m:oMath>
+      <w:r>
+        <w:t xml:space="preserve"> </w:t>
+      </w:r>
+      <w:r>
+        <w:t xml:space="preserve">feedback component that adjusts the leg poses on top of the reference based on the observations.</w:t>
+      </w:r>
+    </w:p>
+    <w:p>
+      <w:pPr>
+        <w:pStyle w:val="FirstParagraph"/>
+      </w:pPr>
+      <m:oMathPara>
+        <m:oMathParaPr>
+          <m:jc m:val="center"/>
+        </m:oMathParaPr>
+        <m:oMath>
+          <m:r>
+            <m:t>a</m:t>
+          </m:r>
+          <m:r>
+            <m:t>(</m:t>
+          </m:r>
+          <m:r>
+            <m:t>t</m:t>
+          </m:r>
+          <m:r>
+            <m:t>,</m:t>
+          </m:r>
+          <m:r>
+            <m:t>o</m:t>
+          </m:r>
+          <m:r>
+            <m:t>)</m:t>
+          </m:r>
+          <m:r>
+            <m:t>=</m:t>
+          </m:r>
+          <m:bar>
+            <m:barPr>
+              <m:pos m:val="top"/>
+            </m:barPr>
+            <m:e>
+              <m:r>
+                <m:t>a</m:t>
+              </m:r>
+            </m:e>
+          </m:bar>
+          <m:r>
+            <m:t>(</m:t>
+          </m:r>
+          <m:r>
+            <m:t>t</m:t>
+          </m:r>
+          <m:r>
+            <m:t>)</m:t>
+          </m:r>
+          <m:r>
+            <m:t>+</m:t>
+          </m:r>
+          <m:r>
+            <m:t>π</m:t>
+          </m:r>
+          <m:r>
+            <m:t>(</m:t>
+          </m:r>
+          <m:r>
+            <m:t>o</m:t>
+          </m:r>
+          <m:r>
+            <m:t>)</m:t>
+          </m:r>
+        </m:oMath>
+      </m:oMathPara>
+    </w:p>
+    <w:p>
+      <w:pPr>
+        <w:pStyle w:val="FirstParagraph"/>
+      </w:pPr>
+      <w:r>
+        <w:t xml:space="preserve">We can infer two importent things:</w:t>
+      </w:r>
+    </w:p>
+    <w:p>
+      <w:pPr>
+        <w:pStyle w:val="Compact"/>
+        <w:numPr>
+          <w:numId w:val="1006"/>
+          <w:ilvl w:val="0"/>
+        </w:numPr>
+      </w:pPr>
+      <w:r>
+        <w:t xml:space="preserve">We need to have a very gool model to produce good determinstic baseline motion which are vital for safety using classical control.</w:t>
+      </w:r>
+    </w:p>
+    <w:p>
+      <w:pPr>
+        <w:pStyle w:val="Compact"/>
+        <w:numPr>
+          <w:numId w:val="1006"/>
+          <w:ilvl w:val="0"/>
+        </w:numPr>
+      </w:pPr>
+      <w:r>
+        <w:t xml:space="preserve">Fine tuning of the motion is more likeable to be better handle by learning based control.</w:t>
+      </w:r>
+    </w:p>
+    <w:p>
+      <w:pPr>
+        <w:pStyle w:val="FirstParagraph"/>
+      </w:pPr>
+      <w:r>
+        <w:t xml:space="preserve">As mentioned earlier further work on learning and control will be mentioned</w:t>
+      </w:r>
+      <w:r>
+        <w:t xml:space="preserve"> </w:t>
+      </w:r>
+      <w:hyperlink r:id="rId28">
+        <w:r>
+          <w:rPr>
+            <w:b/>
+            <w:rStyle w:val="Hyperlink"/>
+          </w:rPr>
+          <w:t xml:space="preserve">here</w:t>
+        </w:r>
+      </w:hyperlink>
+    </w:p>
+    <w:p>
+      <w:pPr>
+        <w:pStyle w:val="BodyText"/>
+      </w:pPr>
+    </w:p>
+    <w:p>
+      <w:pPr>
+        <w:pStyle w:val="Heading4"/>
+      </w:pPr>
+      <w:bookmarkStart w:id="31" w:name="why-we-didnt-do-what-google-did"/>
+      <w:r>
+        <w:t xml:space="preserve">Why we didn’t do what google did ?</w:t>
+      </w:r>
+      <w:bookmarkEnd w:id="31"/>
+    </w:p>
+    <w:p>
+      <w:pPr>
+        <w:pStyle w:val="FirstParagraph"/>
+      </w:pPr>
+      <w:r>
+        <w:t xml:space="preserve">Well, getting accurate model is vital, it is not trivial task, for example google disassembled their robot and weighed each component then, modeled their URDF. Our robot rougly costed around 1,200 USD was made out of hobby grade stuff and was very fragile to disassemble. Plus we didn’t have accurate torque sensor to model the actuator. Google had two controller, one high level controller TX2 and another low level motor driver. We had three Ubuntu to RPI3 (via MQTT Ethernet) and from RPI3 to Servo (via PWM multiplexer). For a perspective MIT Cheetah uses ATI force sensor which is roughly the cost of our entire robot. So, we took the end-effector trajectory and used hand-crafted IK solver in Python to run it on our hardware.</w:t>
+      </w:r>
+    </w:p>
+    <w:p>
+      <w:pPr>
+        <w:pStyle w:val="BodyText"/>
+      </w:pPr>
+    </w:p>
+    <w:p>
+      <w:pPr>
+        <w:pStyle w:val="Heading4"/>
+      </w:pPr>
+      <w:bookmarkStart w:id="32" w:name="can-it-walk-with-hand-crafted-tarjectory"/>
+      <w:r>
+        <w:t xml:space="preserve">Can it walk with hand-crafted tarjectory ?</w:t>
+      </w:r>
+      <w:bookmarkEnd w:id="32"/>
+    </w:p>
+    <w:p>
+      <w:pPr>
+        <w:pStyle w:val="FirstParagraph"/>
+      </w:pPr>
+      <w:r>
+        <w:t xml:space="preserve">It does. If you hand-craft a trajectory, let us say an ellipse, or circle, it will still walk. and adjust the phase difference to get different gaits.</w:t>
+      </w:r>
+    </w:p>
+    <w:p>
+      <w:pPr>
+        <w:pStyle w:val="BodyText"/>
+      </w:pPr>
+    </w:p>
+    <w:p>
+      <w:pPr>
+        <w:pStyle w:val="Heading4"/>
+      </w:pPr>
+      <w:bookmarkStart w:id="33" w:name="then-what-is-the-point-of-getting-a-drl"/>
+      <w:r>
+        <w:t xml:space="preserve">Then What is the point of getting a DRL ?</w:t>
+      </w:r>
+      <w:bookmarkEnd w:id="33"/>
+    </w:p>
+    <w:p>
+      <w:pPr>
+        <w:pStyle w:val="FirstParagraph"/>
+      </w:pPr>
+      <w:r>
+        <w:t xml:space="preserve">Well, the hand crafted may or may not be optimal, but the generated gaits were certainly closer to optimal, given their similrance to other quadruped.</w:t>
+      </w:r>
+    </w:p>
+    <w:p>
+      <w:pPr>
+        <w:pStyle w:val="BodyText"/>
+      </w:pPr>
+      <w:r>
+        <w:t xml:space="preserve"> </w:t>
+      </w:r>
+    </w:p>
+    <w:p>
+      <w:pPr>
+        <w:pStyle w:val="Heading2"/>
+      </w:pPr>
+      <w:bookmarkStart w:id="34" w:name="stoch-2.0"/>
+      <w:r>
+        <w:t xml:space="preserve">Stoch 2.0</w:t>
+      </w:r>
+      <w:bookmarkEnd w:id="34"/>
+    </w:p>
+    <w:p>
+      <w:pPr>
+        <w:pStyle w:val="FirstParagraph"/>
+      </w:pPr>
+      <w:r>
+        <w:t xml:space="preserve">As mentioned earlier stoch 1.0 was too fragile. It had lot of issues. So, we wanted to have more roboust hardware.</w:t>
+      </w:r>
+    </w:p>
+    <w:p>
+      <w:pPr>
+        <w:pStyle w:val="BodyText"/>
+      </w:pPr>
+    </w:p>
+    <w:p>
+      <w:pPr>
+        <w:pStyle w:val="Heading4"/>
+      </w:pPr>
+      <w:bookmarkStart w:id="35" w:name="leg-testing"/>
+      <w:r>
+        <w:t xml:space="preserve">Leg Testing</w:t>
+      </w:r>
+      <w:bookmarkEnd w:id="35"/>
+    </w:p>
+    <w:p>
+      <w:pPr>
+        <w:pStyle w:val="FirstParagraph"/>
+      </w:pPr>
+      <w:r>
+        <w:t xml:space="preserve">Will be updated soon.</w:t>
+      </w:r>
+    </w:p>
+    <w:p>
+      <w:pPr>
+        <w:pStyle w:val="BodyText"/>
+      </w:pPr>
+      <w:r>
+        <w:t xml:space="preserve"> </w:t>
+      </w:r>
+    </w:p>
+    <w:p>
+      <w:pPr>
+        <w:pStyle w:val="Heading2"/>
+      </w:pPr>
+      <w:bookmarkStart w:id="36" w:name="the-team"/>
       <w:r>
         <w:t xml:space="preserve">The Team</w:t>
       </w:r>
-      <w:bookmarkEnd w:id="26"/>
+      <w:bookmarkEnd w:id="36"/>
     </w:p>
     <w:p>
       <w:pPr>
         <w:pStyle w:val="FirstParagraph"/>
       </w:pPr>
       <w:r>
+        <w:rPr>
+          <w:b/>
+        </w:rPr>
         <w:t xml:space="preserve">Team Members:</w:t>
       </w:r>
       <w:r>
         <w:t xml:space="preserve"> </w:t>
       </w:r>
-      <w:hyperlink r:id="rId27">
+      <w:hyperlink r:id="rId37">
         <w:r>
           <w:rPr>
             <w:rStyle w:val="Hyperlink"/>
@@ -586,7 +1129,7 @@
       <w:r>
         <w:t xml:space="preserve"> </w:t>
       </w:r>
-      <w:hyperlink r:id="rId28">
+      <w:hyperlink r:id="rId38">
         <w:r>
           <w:rPr>
             <w:rStyle w:val="Hyperlink"/>
@@ -600,7 +1143,7 @@
       <w:r>
         <w:t xml:space="preserve"> </w:t>
       </w:r>
-      <w:hyperlink r:id="rId29">
+      <w:hyperlink r:id="rId39">
         <w:r>
           <w:rPr>
             <w:rStyle w:val="Hyperlink"/>
@@ -617,7 +1160,7 @@
       <w:r>
         <w:t xml:space="preserve"> </w:t>
       </w:r>
-      <w:hyperlink r:id="rId30">
+      <w:hyperlink r:id="rId40">
         <w:r>
           <w:rPr>
             <w:rStyle w:val="Hyperlink"/>
@@ -631,12 +1174,15 @@
         <w:pStyle w:val="BodyText"/>
       </w:pPr>
       <w:r>
+        <w:rPr>
+          <w:b/>
+        </w:rPr>
         <w:t xml:space="preserve">Principal Investigators:</w:t>
       </w:r>
       <w:r>
         <w:t xml:space="preserve"> </w:t>
       </w:r>
-      <w:hyperlink r:id="rId31">
+      <w:hyperlink r:id="rId41">
         <w:r>
           <w:rPr>
             <w:rStyle w:val="Hyperlink"/>
@@ -650,7 +1196,7 @@
       <w:r>
         <w:t xml:space="preserve"> </w:t>
       </w:r>
-      <w:hyperlink r:id="rId32">
+      <w:hyperlink r:id="rId42">
         <w:r>
           <w:rPr>
             <w:rStyle w:val="Hyperlink"/>
@@ -664,7 +1210,141 @@
         <w:pStyle w:val="BodyText"/>
       </w:pPr>
       <w:r>
-        <w:t xml:space="preserve">I would like to specially thank Shishir, &amp; Prof. Bharadwaj, for giving me a wonderful oppourtinity to work in this project.</w:t>
+        <w:t xml:space="preserve">I would like to specially thank</w:t>
+      </w:r>
+      <w:r>
+        <w:t xml:space="preserve"> </w:t>
+      </w:r>
+      <w:r>
+        <w:rPr>
+          <w:b/>
+        </w:rPr>
+        <w:t xml:space="preserve">Shishir</w:t>
+      </w:r>
+      <w:r>
+        <w:t xml:space="preserve">, &amp;</w:t>
+      </w:r>
+      <w:r>
+        <w:t xml:space="preserve"> </w:t>
+      </w:r>
+      <w:r>
+        <w:rPr>
+          <w:b/>
+        </w:rPr>
+        <w:t xml:space="preserve">Prof. Bharadwaj</w:t>
+      </w:r>
+      <w:r>
+        <w:t xml:space="preserve">, for giving me a wonderful oppourtinity to work in this project.</w:t>
+      </w:r>
+    </w:p>
+    <w:p>
+      <w:pPr>
+        <w:pStyle w:val="CaptionedFigure"/>
+      </w:pPr>
+      <w:r>
+        <w:drawing>
+          <wp:inline>
+            <wp:extent cx="5334000" cy="2667000"/>
+            <wp:effectExtent b="0" l="0" r="0" t="0"/>
+            <wp:docPr descr="Robotics Group at RBCCPS" title="" id="1" name="Picture"/>
+            <a:graphic>
+              <a:graphicData uri="http://schemas.openxmlformats.org/drawingml/2006/picture">
+                <pic:pic>
+                  <pic:nvPicPr>
+                    <pic:cNvPr descr="https://ajaygunalan.github.io/projects/asset/past/stoch/team_hangout.jpg" id="0" name="Picture"/>
+                    <pic:cNvPicPr>
+                      <a:picLocks noChangeArrowheads="1" noChangeAspect="1"/>
+                    </pic:cNvPicPr>
+                  </pic:nvPicPr>
+                  <pic:blipFill>
+                    <a:blip r:embed="rId43"/>
+                    <a:stretch>
+                      <a:fillRect/>
+                    </a:stretch>
+                  </pic:blipFill>
+                  <pic:spPr bwMode="auto">
+                    <a:xfrm>
+                      <a:off x="0" y="0"/>
+                      <a:ext cx="5334000" cy="2667000"/>
+                    </a:xfrm>
+                    <a:prstGeom prst="rect">
+                      <a:avLst/>
+                    </a:prstGeom>
+                    <a:noFill/>
+                    <a:ln w="9525">
+                      <a:noFill/>
+                      <a:headEnd/>
+                      <a:tailEnd/>
+                    </a:ln>
+                  </pic:spPr>
+                </pic:pic>
+              </a:graphicData>
+            </a:graphic>
+          </wp:inline>
+        </w:drawing>
+      </w:r>
+    </w:p>
+    <w:p>
+      <w:pPr>
+        <w:pStyle w:val="ImageCaption"/>
+      </w:pPr>
+      <w:r>
+        <w:t xml:space="preserve">Robotics Group at RBCCPS</w:t>
+      </w:r>
+    </w:p>
+    <w:p>
+      <w:pPr>
+        <w:pStyle w:val="CaptionedFigure"/>
+      </w:pPr>
+      <w:r>
+        <w:drawing>
+          <wp:inline>
+            <wp:extent cx="5334000" cy="3006025"/>
+            <wp:effectExtent b="0" l="0" r="0" t="0"/>
+            <wp:docPr descr="Stoch Team" title="" id="1" name="Picture"/>
+            <a:graphic>
+              <a:graphicData uri="http://schemas.openxmlformats.org/drawingml/2006/picture">
+                <pic:pic>
+                  <pic:nvPicPr>
+                    <pic:cNvPr descr="https://ajaygunalan.github.io/projects/asset/past/stoch/stoch_team.jpg" id="0" name="Picture"/>
+                    <pic:cNvPicPr>
+                      <a:picLocks noChangeArrowheads="1" noChangeAspect="1"/>
+                    </pic:cNvPicPr>
+                  </pic:nvPicPr>
+                  <pic:blipFill>
+                    <a:blip r:embed="rId44"/>
+                    <a:stretch>
+                      <a:fillRect/>
+                    </a:stretch>
+                  </pic:blipFill>
+                  <pic:spPr bwMode="auto">
+                    <a:xfrm>
+                      <a:off x="0" y="0"/>
+                      <a:ext cx="5334000" cy="3006025"/>
+                    </a:xfrm>
+                    <a:prstGeom prst="rect">
+                      <a:avLst/>
+                    </a:prstGeom>
+                    <a:noFill/>
+                    <a:ln w="9525">
+                      <a:noFill/>
+                      <a:headEnd/>
+                      <a:tailEnd/>
+                    </a:ln>
+                  </pic:spPr>
+                </pic:pic>
+              </a:graphicData>
+            </a:graphic>
+          </wp:inline>
+        </w:drawing>
+      </w:r>
+    </w:p>
+    <w:p>
+      <w:pPr>
+        <w:pStyle w:val="ImageCaption"/>
+      </w:pPr>
+      <w:r>
+        <w:t xml:space="preserve">Stoch Team</w:t>
       </w:r>
     </w:p>
     <w:sectPr/>
@@ -1015,6 +1695,118 @@
       </w:pPr>
     </w:lvl>
   </w:abstractNum>
+  <w:abstractNum w:abstractNumId="99411">
+    <w:nsid w:val="71315dca"/>
+    <w:multiLevelType w:val="multilevel"/>
+    <w:lvl w:ilvl="0">
+      <w:start w:val="1"/>
+      <w:numFmt w:val="decimal"/>
+      <w:lvlText w:val="%1."/>
+      <w:lvlJc w:val="left"/>
+      <w:pPr>
+        <w:tabs>
+          <w:tab w:val="num" w:pos="0"/>
+        </w:tabs>
+        <w:ind w:left="480" w:hanging="480"/>
+      </w:pPr>
+    </w:lvl>
+    <w:lvl w:ilvl="1">
+      <w:start w:val="1"/>
+      <w:numFmt w:val="decimal"/>
+      <w:lvlText w:val="%2."/>
+      <w:lvlJc w:val="left"/>
+      <w:pPr>
+        <w:tabs>
+          <w:tab w:val="num" w:pos="720"/>
+        </w:tabs>
+        <w:ind w:left="1200" w:hanging="480"/>
+      </w:pPr>
+    </w:lvl>
+    <w:lvl w:ilvl="2">
+      <w:start w:val="1"/>
+      <w:numFmt w:val="decimal"/>
+      <w:lvlText w:val="%3."/>
+      <w:lvlJc w:val="left"/>
+      <w:pPr>
+        <w:tabs>
+          <w:tab w:val="num" w:pos="1440"/>
+        </w:tabs>
+        <w:ind w:left="1920" w:hanging="480"/>
+      </w:pPr>
+    </w:lvl>
+    <w:lvl w:ilvl="3">
+      <w:start w:val="1"/>
+      <w:numFmt w:val="decimal"/>
+      <w:lvlText w:val="%4."/>
+      <w:lvlJc w:val="left"/>
+      <w:pPr>
+        <w:tabs>
+          <w:tab w:val="num" w:pos="2160"/>
+        </w:tabs>
+        <w:ind w:left="2640" w:hanging="480"/>
+      </w:pPr>
+    </w:lvl>
+    <w:lvl w:ilvl="4">
+      <w:start w:val="1"/>
+      <w:numFmt w:val="decimal"/>
+      <w:lvlText w:val="%5."/>
+      <w:lvlJc w:val="left"/>
+      <w:pPr>
+        <w:tabs>
+          <w:tab w:val="num" w:pos="2880"/>
+        </w:tabs>
+        <w:ind w:left="3360" w:hanging="480"/>
+      </w:pPr>
+    </w:lvl>
+    <w:lvl w:ilvl="5">
+      <w:start w:val="1"/>
+      <w:numFmt w:val="decimal"/>
+      <w:lvlText w:val="%6."/>
+      <w:lvlJc w:val="left"/>
+      <w:pPr>
+        <w:tabs>
+          <w:tab w:val="num" w:pos="3600"/>
+        </w:tabs>
+        <w:ind w:left="4080" w:hanging="480"/>
+      </w:pPr>
+    </w:lvl>
+    <w:lvl w:ilvl="6">
+      <w:start w:val="1"/>
+      <w:numFmt w:val="decimal"/>
+      <w:lvlText w:val="%7."/>
+      <w:lvlJc w:val="left"/>
+      <w:pPr>
+        <w:tabs>
+          <w:tab w:val="num" w:pos="4320"/>
+        </w:tabs>
+        <w:ind w:left="4800" w:hanging="480"/>
+      </w:pPr>
+    </w:lvl>
+    <w:lvl w:ilvl="7">
+      <w:start w:val="1"/>
+      <w:numFmt w:val="decimal"/>
+      <w:lvlText w:val="%8."/>
+      <w:lvlJc w:val="left"/>
+      <w:pPr>
+        <w:tabs>
+          <w:tab w:val="num" w:pos="5040"/>
+        </w:tabs>
+        <w:ind w:left="5520" w:hanging="480"/>
+      </w:pPr>
+    </w:lvl>
+    <w:lvl w:ilvl="8">
+      <w:start w:val="1"/>
+      <w:numFmt w:val="decimal"/>
+      <w:lvlText w:val="%9."/>
+      <w:lvlJc w:val="left"/>
+      <w:pPr>
+        <w:tabs>
+          <w:tab w:val="num" w:pos="5760"/>
+        </w:tabs>
+        <w:ind w:left="6240" w:hanging="480"/>
+      </w:pPr>
+    </w:lvl>
+  </w:abstractNum>
   <w:num w:numId="1000">
     <w:abstractNumId w:val="990"/>
   </w:num>
@@ -1023,6 +1815,156 @@
   </w:num>
   <w:num w:numId="1001">
     <w:abstractNumId w:val="99201"/>
+    <w:lvlOverride w:ilvl="0">
+      <w:startOverride w:val="1"/>
+    </w:lvlOverride>
+    <w:lvlOverride w:ilvl="1">
+      <w:startOverride w:val="1"/>
+    </w:lvlOverride>
+    <w:lvlOverride w:ilvl="2">
+      <w:startOverride w:val="1"/>
+    </w:lvlOverride>
+    <w:lvlOverride w:ilvl="3">
+      <w:startOverride w:val="1"/>
+    </w:lvlOverride>
+    <w:lvlOverride w:ilvl="4">
+      <w:startOverride w:val="1"/>
+    </w:lvlOverride>
+    <w:lvlOverride w:ilvl="5">
+      <w:startOverride w:val="1"/>
+    </w:lvlOverride>
+    <w:lvlOverride w:ilvl="6">
+      <w:startOverride w:val="1"/>
+    </w:lvlOverride>
+    <w:lvlOverride w:ilvl="7">
+      <w:startOverride w:val="1"/>
+    </w:lvlOverride>
+    <w:lvlOverride w:ilvl="8">
+      <w:startOverride w:val="1"/>
+    </w:lvlOverride>
+  </w:num>
+  <w:num w:numId="1002">
+    <w:abstractNumId w:val="99411"/>
+    <w:lvlOverride w:ilvl="0">
+      <w:startOverride w:val="1"/>
+    </w:lvlOverride>
+    <w:lvlOverride w:ilvl="1">
+      <w:startOverride w:val="1"/>
+    </w:lvlOverride>
+    <w:lvlOverride w:ilvl="2">
+      <w:startOverride w:val="1"/>
+    </w:lvlOverride>
+    <w:lvlOverride w:ilvl="3">
+      <w:startOverride w:val="1"/>
+    </w:lvlOverride>
+    <w:lvlOverride w:ilvl="4">
+      <w:startOverride w:val="1"/>
+    </w:lvlOverride>
+    <w:lvlOverride w:ilvl="5">
+      <w:startOverride w:val="1"/>
+    </w:lvlOverride>
+    <w:lvlOverride w:ilvl="6">
+      <w:startOverride w:val="1"/>
+    </w:lvlOverride>
+    <w:lvlOverride w:ilvl="7">
+      <w:startOverride w:val="1"/>
+    </w:lvlOverride>
+    <w:lvlOverride w:ilvl="8">
+      <w:startOverride w:val="1"/>
+    </w:lvlOverride>
+  </w:num>
+  <w:num w:numId="1003">
+    <w:abstractNumId w:val="99411"/>
+    <w:lvlOverride w:ilvl="0">
+      <w:startOverride w:val="1"/>
+    </w:lvlOverride>
+    <w:lvlOverride w:ilvl="1">
+      <w:startOverride w:val="1"/>
+    </w:lvlOverride>
+    <w:lvlOverride w:ilvl="2">
+      <w:startOverride w:val="1"/>
+    </w:lvlOverride>
+    <w:lvlOverride w:ilvl="3">
+      <w:startOverride w:val="1"/>
+    </w:lvlOverride>
+    <w:lvlOverride w:ilvl="4">
+      <w:startOverride w:val="1"/>
+    </w:lvlOverride>
+    <w:lvlOverride w:ilvl="5">
+      <w:startOverride w:val="1"/>
+    </w:lvlOverride>
+    <w:lvlOverride w:ilvl="6">
+      <w:startOverride w:val="1"/>
+    </w:lvlOverride>
+    <w:lvlOverride w:ilvl="7">
+      <w:startOverride w:val="1"/>
+    </w:lvlOverride>
+    <w:lvlOverride w:ilvl="8">
+      <w:startOverride w:val="1"/>
+    </w:lvlOverride>
+  </w:num>
+  <w:num w:numId="1004">
+    <w:abstractNumId w:val="99411"/>
+    <w:lvlOverride w:ilvl="0">
+      <w:startOverride w:val="1"/>
+    </w:lvlOverride>
+    <w:lvlOverride w:ilvl="1">
+      <w:startOverride w:val="1"/>
+    </w:lvlOverride>
+    <w:lvlOverride w:ilvl="2">
+      <w:startOverride w:val="1"/>
+    </w:lvlOverride>
+    <w:lvlOverride w:ilvl="3">
+      <w:startOverride w:val="1"/>
+    </w:lvlOverride>
+    <w:lvlOverride w:ilvl="4">
+      <w:startOverride w:val="1"/>
+    </w:lvlOverride>
+    <w:lvlOverride w:ilvl="5">
+      <w:startOverride w:val="1"/>
+    </w:lvlOverride>
+    <w:lvlOverride w:ilvl="6">
+      <w:startOverride w:val="1"/>
+    </w:lvlOverride>
+    <w:lvlOverride w:ilvl="7">
+      <w:startOverride w:val="1"/>
+    </w:lvlOverride>
+    <w:lvlOverride w:ilvl="8">
+      <w:startOverride w:val="1"/>
+    </w:lvlOverride>
+  </w:num>
+  <w:num w:numId="1005">
+    <w:abstractNumId w:val="99411"/>
+    <w:lvlOverride w:ilvl="0">
+      <w:startOverride w:val="1"/>
+    </w:lvlOverride>
+    <w:lvlOverride w:ilvl="1">
+      <w:startOverride w:val="1"/>
+    </w:lvlOverride>
+    <w:lvlOverride w:ilvl="2">
+      <w:startOverride w:val="1"/>
+    </w:lvlOverride>
+    <w:lvlOverride w:ilvl="3">
+      <w:startOverride w:val="1"/>
+    </w:lvlOverride>
+    <w:lvlOverride w:ilvl="4">
+      <w:startOverride w:val="1"/>
+    </w:lvlOverride>
+    <w:lvlOverride w:ilvl="5">
+      <w:startOverride w:val="1"/>
+    </w:lvlOverride>
+    <w:lvlOverride w:ilvl="6">
+      <w:startOverride w:val="1"/>
+    </w:lvlOverride>
+    <w:lvlOverride w:ilvl="7">
+      <w:startOverride w:val="1"/>
+    </w:lvlOverride>
+    <w:lvlOverride w:ilvl="8">
+      <w:startOverride w:val="1"/>
+    </w:lvlOverride>
+  </w:num>
+  <w:num w:numId="1006">
+    <w:abstractNumId w:val="99411"/>
     <w:lvlOverride w:ilvl="0">
       <w:startOverride w:val="1"/>
     </w:lvlOverride>

</xml_diff>

<commit_message>
major restructrung done ver 2.0 needs fine tuning
</commit_message>
<xml_diff>
--- a/_includes/projects/past/stoch/output/stoch.docx
+++ b/_includes/projects/past/stoch/output/stoch.docx
@@ -42,15 +42,9 @@
       <w:r>
         <w:t xml:space="preserve"> </w:t>
       </w:r>
-      <w:hyperlink r:id="rId20">
-        <w:r>
-          <w:rPr>
-            <w:b/>
-            <w:rStyle w:val="Hyperlink"/>
-          </w:rPr>
-          <w:t xml:space="preserve">RBCCPS</w:t>
-        </w:r>
-      </w:hyperlink>
+      <w:r>
+        <w:t xml:space="preserve">RBCCPS</w:t>
+      </w:r>
     </w:p>
     <w:p>
       <w:pPr>
@@ -78,11 +72,11 @@
       <w:pPr>
         <w:pStyle w:val="Heading2"/>
       </w:pPr>
-      <w:bookmarkStart w:id="21" w:name="breif-overview"/>
+      <w:bookmarkStart w:id="20" w:name="breif-overview"/>
       <w:r>
         <w:t xml:space="preserve">Breif Overview</w:t>
       </w:r>
-      <w:bookmarkEnd w:id="21"/>
+      <w:bookmarkEnd w:id="20"/>
     </w:p>
     <w:p>
       <w:pPr>
@@ -104,7 +98,7 @@
                     </pic:cNvPicPr>
                   </pic:nvPicPr>
                   <pic:blipFill>
-                    <a:blip r:embed="rId22"/>
+                    <a:blip r:embed="rId21"/>
                     <a:stretch>
                       <a:fillRect/>
                     </a:stretch>
@@ -455,11 +449,11 @@
       <w:pPr>
         <w:pStyle w:val="Heading4"/>
       </w:pPr>
-      <w:bookmarkStart w:id="23" w:name="what-was-achieved-by-stoch-1.0"/>
+      <w:bookmarkStart w:id="22" w:name="what-was-achieved-by-stoch-1.0"/>
       <w:r>
         <w:t xml:space="preserve">What was achieved by Stoch 1.0 ?</w:t>
       </w:r>
-      <w:bookmarkEnd w:id="23"/>
+      <w:bookmarkEnd w:id="22"/>
     </w:p>
     <w:p>
       <w:pPr>
@@ -471,7 +465,7 @@
       <w:r>
         <w:t xml:space="preserve"> </w:t>
       </w:r>
-      <w:hyperlink r:id="rId24">
+      <w:hyperlink r:id="rId23">
         <w:r>
           <w:rPr>
             <w:b/>
@@ -490,11 +484,11 @@
       <w:pPr>
         <w:pStyle w:val="Heading4"/>
       </w:pPr>
-      <w:bookmarkStart w:id="25" w:name="how-we-achieved"/>
+      <w:bookmarkStart w:id="24" w:name="how-we-achieved"/>
       <w:r>
         <w:t xml:space="preserve">How we achieved ?</w:t>
       </w:r>
-      <w:bookmarkEnd w:id="25"/>
+      <w:bookmarkEnd w:id="24"/>
     </w:p>
     <w:p>
       <w:pPr>
@@ -514,7 +508,7 @@
       <w:r>
         <w:t xml:space="preserve"> </w:t>
       </w:r>
-      <w:hyperlink r:id="rId26">
+      <w:hyperlink r:id="rId25">
         <w:r>
           <w:rPr>
             <w:b/>
@@ -533,11 +527,11 @@
       <w:pPr>
         <w:pStyle w:val="Heading4"/>
       </w:pPr>
-      <w:bookmarkStart w:id="27" w:name="next-what"/>
+      <w:bookmarkStart w:id="26" w:name="next-what"/>
       <w:r>
         <w:t xml:space="preserve">Next what ?</w:t>
       </w:r>
-      <w:bookmarkEnd w:id="27"/>
+      <w:bookmarkEnd w:id="26"/>
     </w:p>
     <w:p>
       <w:pPr>
@@ -593,7 +587,7 @@
       <w:r>
         <w:t xml:space="preserve"> </w:t>
       </w:r>
-      <w:hyperlink r:id="rId28">
+      <w:hyperlink r:id="rId27">
         <w:r>
           <w:rPr>
             <w:b/>
@@ -623,11 +617,11 @@
       <w:pPr>
         <w:pStyle w:val="Heading2"/>
       </w:pPr>
-      <w:bookmarkStart w:id="29" w:name="stoch-1.0"/>
+      <w:bookmarkStart w:id="28" w:name="stoch-1.0"/>
       <w:r>
         <w:t xml:space="preserve">Stoch 1.0</w:t>
       </w:r>
-      <w:bookmarkEnd w:id="29"/>
+      <w:bookmarkEnd w:id="28"/>
     </w:p>
     <w:p>
       <w:pPr>
@@ -639,7 +633,7 @@
       <w:r>
         <w:t xml:space="preserve"> </w:t>
       </w:r>
-      <w:hyperlink r:id="rId30">
+      <w:hyperlink r:id="rId29">
         <w:r>
           <w:rPr>
             <w:b/>
@@ -956,7 +950,7 @@
       <w:r>
         <w:t xml:space="preserve"> </w:t>
       </w:r>
-      <w:hyperlink r:id="rId28">
+      <w:hyperlink r:id="rId27">
         <w:r>
           <w:rPr>
             <w:b/>
@@ -975,10 +969,33 @@
       <w:pPr>
         <w:pStyle w:val="Heading4"/>
       </w:pPr>
-      <w:bookmarkStart w:id="31" w:name="why-we-didnt-do-what-google-did"/>
+      <w:bookmarkStart w:id="30" w:name="why-we-didnt-do-what-google-did"/>
       <w:r>
         <w:t xml:space="preserve">Why we didn’t do what google did ?</w:t>
       </w:r>
+      <w:bookmarkEnd w:id="30"/>
+    </w:p>
+    <w:p>
+      <w:pPr>
+        <w:pStyle w:val="FirstParagraph"/>
+      </w:pPr>
+      <w:r>
+        <w:t xml:space="preserve">Well, getting accurate model is vital, it is not trivial task, for example google disassembled their robot and weighed each component then, modeled their URDF. Our robot rougly costed around 1,200 USD was made out of hobby grade stuff and was very fragile to disassemble. Plus we didn’t have accurate torque sensor to model the actuator. Google had two controller, one high level controller TX2 and another low level motor driver. We had three Ubuntu to RPI3 (via MQTT Ethernet) and from RPI3 to Servo (via PWM multiplexer). For a perspective MIT Cheetah uses ATI force sensor which is roughly the cost of our entire robot. So, we took the end-effector trajectory and used hand-crafted IK solver in Python to run it on our hardware.</w:t>
+      </w:r>
+    </w:p>
+    <w:p>
+      <w:pPr>
+        <w:pStyle w:val="BodyText"/>
+      </w:pPr>
+    </w:p>
+    <w:p>
+      <w:pPr>
+        <w:pStyle w:val="Heading4"/>
+      </w:pPr>
+      <w:bookmarkStart w:id="31" w:name="can-it-walk-with-hand-crafted-tarjectory"/>
+      <w:r>
+        <w:t xml:space="preserve">Can it walk with hand-crafted tarjectory ?</w:t>
+      </w:r>
       <w:bookmarkEnd w:id="31"/>
     </w:p>
     <w:p>
@@ -986,7 +1003,7 @@
         <w:pStyle w:val="FirstParagraph"/>
       </w:pPr>
       <w:r>
-        <w:t xml:space="preserve">Well, getting accurate model is vital, it is not trivial task, for example google disassembled their robot and weighed each component then, modeled their URDF. Our robot rougly costed around 1,200 USD was made out of hobby grade stuff and was very fragile to disassemble. Plus we didn’t have accurate torque sensor to model the actuator. Google had two controller, one high level controller TX2 and another low level motor driver. We had three Ubuntu to RPI3 (via MQTT Ethernet) and from RPI3 to Servo (via PWM multiplexer). For a perspective MIT Cheetah uses ATI force sensor which is roughly the cost of our entire robot. So, we took the end-effector trajectory and used hand-crafted IK solver in Python to run it on our hardware.</w:t>
+        <w:t xml:space="preserve">It does. If you hand-craft a trajectory, let us say an ellipse, or circle, it will still walk. and adjust the phase difference to get different gaits.</w:t>
       </w:r>
     </w:p>
     <w:p>
@@ -998,9 +1015,9 @@
       <w:pPr>
         <w:pStyle w:val="Heading4"/>
       </w:pPr>
-      <w:bookmarkStart w:id="32" w:name="can-it-walk-with-hand-crafted-tarjectory"/>
-      <w:r>
-        <w:t xml:space="preserve">Can it walk with hand-crafted tarjectory ?</w:t>
+      <w:bookmarkStart w:id="32" w:name="then-what-is-the-point-of-getting-a-drl"/>
+      <w:r>
+        <w:t xml:space="preserve">Then What is the point of getting a DRL ?</w:t>
       </w:r>
       <w:bookmarkEnd w:id="32"/>
     </w:p>
@@ -1009,30 +1026,56 @@
         <w:pStyle w:val="FirstParagraph"/>
       </w:pPr>
       <w:r>
-        <w:t xml:space="preserve">It does. If you hand-craft a trajectory, let us say an ellipse, or circle, it will still walk. and adjust the phase difference to get different gaits.</w:t>
+        <w:t xml:space="preserve">Well, the hand crafted may or may not be optimal, but the generated gaits were certainly closer to optimal, given their similrance to other quadruped.</w:t>
       </w:r>
     </w:p>
     <w:p>
       <w:pPr>
         <w:pStyle w:val="BodyText"/>
       </w:pPr>
+      <w:r>
+        <w:t xml:space="preserve"> </w:t>
+      </w:r>
+    </w:p>
+    <w:p>
+      <w:pPr>
+        <w:pStyle w:val="Heading2"/>
+      </w:pPr>
+      <w:bookmarkStart w:id="33" w:name="stoch-2.0"/>
+      <w:r>
+        <w:t xml:space="preserve">Stoch 2.0</w:t>
+      </w:r>
+      <w:bookmarkEnd w:id="33"/>
+    </w:p>
+    <w:p>
+      <w:pPr>
+        <w:pStyle w:val="FirstParagraph"/>
+      </w:pPr>
+      <w:r>
+        <w:t xml:space="preserve">As mentioned earlier stoch 1.0 was too fragile. It had lot of issues. So, we wanted to have more roboust hardware.</w:t>
+      </w:r>
+    </w:p>
+    <w:p>
+      <w:pPr>
+        <w:pStyle w:val="BodyText"/>
+      </w:pPr>
     </w:p>
     <w:p>
       <w:pPr>
         <w:pStyle w:val="Heading4"/>
       </w:pPr>
-      <w:bookmarkStart w:id="33" w:name="then-what-is-the-point-of-getting-a-drl"/>
-      <w:r>
-        <w:t xml:space="preserve">Then What is the point of getting a DRL ?</w:t>
-      </w:r>
-      <w:bookmarkEnd w:id="33"/>
+      <w:bookmarkStart w:id="34" w:name="leg-testing"/>
+      <w:r>
+        <w:t xml:space="preserve">Leg Testing</w:t>
+      </w:r>
+      <w:bookmarkEnd w:id="34"/>
     </w:p>
     <w:p>
       <w:pPr>
         <w:pStyle w:val="FirstParagraph"/>
       </w:pPr>
       <w:r>
-        <w:t xml:space="preserve">Well, the hand crafted may or may not be optimal, but the generated gaits were certainly closer to optimal, given their similrance to other quadruped.</w:t>
+        <w:t xml:space="preserve">Will be updated soon.</w:t>
       </w:r>
     </w:p>
     <w:p>
@@ -1047,60 +1090,11 @@
       <w:pPr>
         <w:pStyle w:val="Heading2"/>
       </w:pPr>
-      <w:bookmarkStart w:id="34" w:name="stoch-2.0"/>
-      <w:r>
-        <w:t xml:space="preserve">Stoch 2.0</w:t>
-      </w:r>
-      <w:bookmarkEnd w:id="34"/>
-    </w:p>
-    <w:p>
-      <w:pPr>
-        <w:pStyle w:val="FirstParagraph"/>
-      </w:pPr>
-      <w:r>
-        <w:t xml:space="preserve">As mentioned earlier stoch 1.0 was too fragile. It had lot of issues. So, we wanted to have more roboust hardware.</w:t>
-      </w:r>
-    </w:p>
-    <w:p>
-      <w:pPr>
-        <w:pStyle w:val="BodyText"/>
-      </w:pPr>
-    </w:p>
-    <w:p>
-      <w:pPr>
-        <w:pStyle w:val="Heading4"/>
-      </w:pPr>
-      <w:bookmarkStart w:id="35" w:name="leg-testing"/>
-      <w:r>
-        <w:t xml:space="preserve">Leg Testing</w:t>
+      <w:bookmarkStart w:id="35" w:name="the-team"/>
+      <w:r>
+        <w:t xml:space="preserve">The Team</w:t>
       </w:r>
       <w:bookmarkEnd w:id="35"/>
-    </w:p>
-    <w:p>
-      <w:pPr>
-        <w:pStyle w:val="FirstParagraph"/>
-      </w:pPr>
-      <w:r>
-        <w:t xml:space="preserve">Will be updated soon.</w:t>
-      </w:r>
-    </w:p>
-    <w:p>
-      <w:pPr>
-        <w:pStyle w:val="BodyText"/>
-      </w:pPr>
-      <w:r>
-        <w:t xml:space="preserve"> </w:t>
-      </w:r>
-    </w:p>
-    <w:p>
-      <w:pPr>
-        <w:pStyle w:val="Heading2"/>
-      </w:pPr>
-      <w:bookmarkStart w:id="36" w:name="the-team"/>
-      <w:r>
-        <w:t xml:space="preserve">The Team</w:t>
-      </w:r>
-      <w:bookmarkEnd w:id="36"/>
     </w:p>
     <w:p>
       <w:pPr>
@@ -1115,7 +1109,7 @@
       <w:r>
         <w:t xml:space="preserve"> </w:t>
       </w:r>
-      <w:hyperlink r:id="rId37">
+      <w:hyperlink r:id="rId36">
         <w:r>
           <w:rPr>
             <w:rStyle w:val="Hyperlink"/>
@@ -1129,7 +1123,7 @@
       <w:r>
         <w:t xml:space="preserve"> </w:t>
       </w:r>
-      <w:hyperlink r:id="rId38">
+      <w:hyperlink r:id="rId37">
         <w:r>
           <w:rPr>
             <w:rStyle w:val="Hyperlink"/>
@@ -1143,7 +1137,7 @@
       <w:r>
         <w:t xml:space="preserve"> </w:t>
       </w:r>
-      <w:hyperlink r:id="rId39">
+      <w:hyperlink r:id="rId38">
         <w:r>
           <w:rPr>
             <w:rStyle w:val="Hyperlink"/>
@@ -1160,7 +1154,7 @@
       <w:r>
         <w:t xml:space="preserve"> </w:t>
       </w:r>
-      <w:hyperlink r:id="rId40">
+      <w:hyperlink r:id="rId39">
         <w:r>
           <w:rPr>
             <w:rStyle w:val="Hyperlink"/>
@@ -1182,7 +1176,7 @@
       <w:r>
         <w:t xml:space="preserve"> </w:t>
       </w:r>
-      <w:hyperlink r:id="rId41">
+      <w:hyperlink r:id="rId40">
         <w:r>
           <w:rPr>
             <w:rStyle w:val="Hyperlink"/>
@@ -1196,7 +1190,7 @@
       <w:r>
         <w:t xml:space="preserve"> </w:t>
       </w:r>
-      <w:hyperlink r:id="rId42">
+      <w:hyperlink r:id="rId41">
         <w:r>
           <w:rPr>
             <w:rStyle w:val="Hyperlink"/>
@@ -1257,7 +1251,7 @@
                     </pic:cNvPicPr>
                   </pic:nvPicPr>
                   <pic:blipFill>
-                    <a:blip r:embed="rId43"/>
+                    <a:blip r:embed="rId42"/>
                     <a:stretch>
                       <a:fillRect/>
                     </a:stretch>
@@ -1312,7 +1306,7 @@
                     </pic:cNvPicPr>
                   </pic:nvPicPr>
                   <pic:blipFill>
-                    <a:blip r:embed="rId44"/>
+                    <a:blip r:embed="rId43"/>
                     <a:stretch>
                       <a:fillRect/>
                     </a:stretch>

</xml_diff>